<commit_message>
Segundo Cambio : Probando que si estese bien
</commit_message>
<xml_diff>
--- a/Actividad.docx
+++ b/Actividad.docx
@@ -49,15 +49,7 @@
         <w:t xml:space="preserve"> </w:t>
       </w:r>
       <w:r>
-        <w:t>flujos de trabajo profesionales (</w:t>
-      </w:r>
-      <w:proofErr w:type="spellStart"/>
-      <w:r>
-        <w:t>Gitflow</w:t>
-      </w:r>
-      <w:proofErr w:type="spellEnd"/>
-      <w:r>
-        <w:t>), fortaleciendo la capacidad de análisis,</w:t>
+        <w:t>flujos de trabajo profesionales (Gitflow), fortaleciendo la capacidad de análisis,</w:t>
       </w:r>
       <w:r>
         <w:t xml:space="preserve"> </w:t>
@@ -76,6 +68,9 @@
       <w:pPr>
         <w:jc w:val="both"/>
       </w:pPr>
+      <w:r>
+        <w:t>Probando sisisiisiisisisis</w:t>
+      </w:r>
     </w:p>
     <w:sectPr>
       <w:pgSz w:w="12240" w:h="15840"/>

</xml_diff>